<commit_message>
fix: photo grid fills left-to-right then down, not column-by-column
The old template relied on a Word "3-column newspaper" section break
around the photo loop, which is inherently column-major (fills one
column fully before starting the next) -- that's why 6 photos showed
as two groups of 3 by area instead of a proper grid. Replaced it with
a real 3-per-row table, with photos chunked into rows in JS
(photo_rows) instead of relying on Word's column flow.
</commit_message>
<xml_diff>
--- a/src/templates/council-inspection.docx
+++ b/src/templates/council-inspection.docx
@@ -862,265 +862,291 @@
           <w:type w:val="nextPage"/>
           <w:pgSz w:w="11900" w:h="16840"/>
           <w:pgMar w:top="720" w:right="720" w:bottom="720" w:left="720" w:header="705" w:footer="335" w:gutter="0"/>
-          <w:cols w:num="3" w:space="113"/>
+          <w:cols w:space="113"/>
           <w:docGrid w:linePitch="326"/>
         </w:sectPr>
       </w:pPr>
-    </w:p>
-    <w:p>
-      <w:r>
-        <w:t>{#report_photos}</w:t>
-      </w:r>
     </w:p>
     <w:tbl>
       <w:tblPr>
-        <w:tblStyle w:val="TableGrid"/>
         <w:tblW w:w="0" w:type="auto"/>
         <w:tblBorders>
-          <w:top w:val="single" w:sz="4" w:space="0" w:color="A6A6A6" w:themeColor="background1" w:themeShade="A6"/>
-          <w:left w:val="single" w:sz="4" w:space="0" w:color="A6A6A6" w:themeColor="background1" w:themeShade="A6"/>
-          <w:bottom w:val="single" w:sz="4" w:space="0" w:color="A6A6A6" w:themeColor="background1" w:themeShade="A6"/>
-          <w:right w:val="single" w:sz="4" w:space="0" w:color="A6A6A6" w:themeColor="background1" w:themeShade="A6"/>
-          <w:insideH w:val="single" w:sz="4" w:space="0" w:color="A6A6A6" w:themeColor="background1" w:themeShade="A6"/>
-          <w:insideV w:val="single" w:sz="4" w:space="0" w:color="A6A6A6" w:themeColor="background1" w:themeShade="A6"/>
+          <w:top w:val="none" w:sz="0" w:space="0" w:color="auto"/>
+          <w:left w:val="none" w:sz="0" w:space="0" w:color="auto"/>
+          <w:bottom w:val="none" w:sz="0" w:space="0" w:color="auto"/>
+          <w:right w:val="none" w:sz="0" w:space="0" w:color="auto"/>
+          <w:insideH w:val="none" w:sz="0" w:space="0" w:color="auto"/>
+          <w:insideV w:val="none" w:sz="0" w:space="0" w:color="auto"/>
         </w:tblBorders>
-        <w:tblLook w:val="04A0" w:firstRow="1" w:lastRow="0" w:firstColumn="1" w:lastColumn="0" w:noHBand="0" w:noVBand="1"/>
+        <w:tblLook w:val="0000" w:firstRow="0" w:lastRow="0" w:firstColumn="0" w:lastColumn="0" w:noHBand="1" w:noVBand="1"/>
       </w:tblPr>
       <w:tblGrid>
-        <w:gridCol w:w="675"/>
-        <w:gridCol w:w="458"/>
-        <w:gridCol w:w="574"/>
-        <w:gridCol w:w="1699"/>
+        <w:gridCol w:w="3406"/>
+        <w:gridCol w:w="3406"/>
+        <w:gridCol w:w="3406"/>
       </w:tblGrid>
       <w:tr>
-        <w:trPr>
-          <w:cantSplit/>
-          <w:trHeight w:val="397" w:hRule="exact"/>
-        </w:trPr>
         <w:tc>
           <w:tcPr>
-            <w:tcW w:w="675" w:type="dxa"/>
-            <w:tcBorders>
-              <w:right w:val="nil"/>
-            </w:tcBorders>
-            <w:shd w:val="clear" w:color="auto" w:fill="F2F2F2" w:themeFill="background1" w:themeFillShade="F2"/>
-            <w:vAlign w:val="center"/>
+            <w:tcW w:w="3406" w:type="dxa"/>
+            <w:vAlign w:val="top"/>
           </w:tcPr>
           <w:p>
-            <w:pPr>
-              <w:keepNext/>
-              <w:keepLines/>
-              <w:pStyle w:val="NormalWeb"/>
-              <w:spacing w:before="0" w:beforeAutospacing="0" w:after="0" w:afterAutospacing="0"/>
-              <w:rPr>
-                <w:rFonts w:asciiTheme="majorHAnsi" w:hAnsiTheme="majorHAnsi" w:cstheme="majorHAnsi"/>
-                <w:b/>
-                <w:bCs/>
-                <w:sz w:val="16"/>
-                <w:szCs w:val="16"/>
-              </w:rPr>
-            </w:pPr>
             <w:r>
-              <w:rPr>
-                <w:rFonts w:asciiTheme="majorHAnsi" w:hAnsiTheme="majorHAnsi" w:cstheme="majorHAnsi"/>
-                <w:b/>
-                <w:bCs/>
-                <w:sz w:val="16"/>
-                <w:szCs w:val="16"/>
-              </w:rPr>
-              <w:t>Image</w:t>
-            </w:r>
-            <w:r>
-              <w:rPr>
-                <w:rFonts w:asciiTheme="majorHAnsi" w:hAnsiTheme="majorHAnsi" w:cstheme="majorHAnsi"/>
-                <w:b/>
-                <w:bCs/>
-                <w:sz w:val="16"/>
-                <w:szCs w:val="16"/>
-              </w:rPr>
-              <w:t>:</w:t>
+              <w:t>{#photo_rows}{#.}</w:t>
             </w:r>
           </w:p>
-        </w:tc>
-        <w:tc>
-          <w:tcPr>
-            <w:tcW w:w="458" w:type="dxa"/>
-            <w:tcBorders>
-              <w:left w:val="nil"/>
-              <w:right w:val="nil"/>
-            </w:tcBorders>
-            <w:shd w:val="clear" w:color="auto" w:fill="F2F2F2" w:themeFill="background1" w:themeFillShade="F2"/>
-            <w:vAlign w:val="center"/>
-          </w:tcPr>
+          <w:tbl>
+            <w:tblPr>
+              <w:tblStyle w:val="TableGrid"/>
+              <w:tblW w:w="0" w:type="auto"/>
+              <w:tblBorders>
+                <w:top w:val="single" w:sz="4" w:space="0" w:color="A6A6A6" w:themeColor="background1" w:themeShade="A6"/>
+                <w:left w:val="single" w:sz="4" w:space="0" w:color="A6A6A6" w:themeColor="background1" w:themeShade="A6"/>
+                <w:bottom w:val="single" w:sz="4" w:space="0" w:color="A6A6A6" w:themeColor="background1" w:themeShade="A6"/>
+                <w:right w:val="single" w:sz="4" w:space="0" w:color="A6A6A6" w:themeColor="background1" w:themeShade="A6"/>
+                <w:insideH w:val="single" w:sz="4" w:space="0" w:color="A6A6A6" w:themeColor="background1" w:themeShade="A6"/>
+                <w:insideV w:val="single" w:sz="4" w:space="0" w:color="A6A6A6" w:themeColor="background1" w:themeShade="A6"/>
+              </w:tblBorders>
+              <w:tblLook w:val="04A0" w:firstRow="1" w:lastRow="0" w:firstColumn="1" w:lastColumn="0" w:noHBand="0" w:noVBand="1"/>
+            </w:tblPr>
+            <w:tblGrid>
+              <w:gridCol w:w="675"/>
+              <w:gridCol w:w="458"/>
+              <w:gridCol w:w="574"/>
+              <w:gridCol w:w="1699"/>
+            </w:tblGrid>
+            <w:tr>
+              <w:trPr>
+                <w:cantSplit/>
+                <w:trHeight w:val="397" w:hRule="exact"/>
+              </w:trPr>
+              <w:tc>
+                <w:tcPr>
+                  <w:tcW w:w="675" w:type="dxa"/>
+                  <w:tcBorders>
+                    <w:right w:val="nil"/>
+                  </w:tcBorders>
+                  <w:shd w:val="clear" w:color="auto" w:fill="F2F2F2" w:themeFill="background1" w:themeFillShade="F2"/>
+                  <w:vAlign w:val="center"/>
+                </w:tcPr>
+                <w:p>
+                  <w:pPr>
+                    <w:keepNext/>
+                    <w:keepLines/>
+                    <w:pStyle w:val="NormalWeb"/>
+                    <w:spacing w:before="0" w:beforeAutospacing="0" w:after="0" w:afterAutospacing="0"/>
+                    <w:rPr>
+                      <w:rFonts w:asciiTheme="majorHAnsi" w:hAnsiTheme="majorHAnsi" w:cstheme="majorHAnsi"/>
+                      <w:b/>
+                      <w:bCs/>
+                      <w:sz w:val="16"/>
+                      <w:szCs w:val="16"/>
+                    </w:rPr>
+                  </w:pPr>
+                  <w:r>
+                    <w:rPr>
+                      <w:rFonts w:asciiTheme="majorHAnsi" w:hAnsiTheme="majorHAnsi" w:cstheme="majorHAnsi"/>
+                      <w:b/>
+                      <w:bCs/>
+                      <w:sz w:val="16"/>
+                      <w:szCs w:val="16"/>
+                    </w:rPr>
+                    <w:t>Image</w:t>
+                  </w:r>
+                  <w:r>
+                    <w:rPr>
+                      <w:rFonts w:asciiTheme="majorHAnsi" w:hAnsiTheme="majorHAnsi" w:cstheme="majorHAnsi"/>
+                      <w:b/>
+                      <w:bCs/>
+                      <w:sz w:val="16"/>
+                      <w:szCs w:val="16"/>
+                    </w:rPr>
+                    <w:t>:</w:t>
+                  </w:r>
+                </w:p>
+              </w:tc>
+              <w:tc>
+                <w:tcPr>
+                  <w:tcW w:w="458" w:type="dxa"/>
+                  <w:tcBorders>
+                    <w:left w:val="nil"/>
+                    <w:right w:val="nil"/>
+                  </w:tcBorders>
+                  <w:shd w:val="clear" w:color="auto" w:fill="F2F2F2" w:themeFill="background1" w:themeFillShade="F2"/>
+                  <w:vAlign w:val="center"/>
+                </w:tcPr>
+                <w:p>
+                  <w:pPr>
+                    <w:keepNext/>
+                    <w:keepLines/>
+                    <w:rPr>
+                      <w:rFonts w:asciiTheme="majorHAnsi" w:hAnsiTheme="majorHAnsi" w:cstheme="majorHAnsi"/>
+                      <w:color w:val="000000"/>
+                      <w:sz w:val="16"/>
+                      <w:szCs w:val="16"/>
+                    </w:rPr>
+                  </w:pPr>
+                  <w:r>
+                    <w:rPr>
+                      <w:rFonts w:asciiTheme="majorHAnsi" w:hAnsiTheme="majorHAnsi" w:cstheme="majorHAnsi"/>
+                      <w:color w:val="000000"/>
+                      <w:sz w:val="16"/>
+                      <w:szCs w:val="16"/>
+                    </w:rPr>
+                    <w:t>{number}</w:t>
+                  </w:r>
+                </w:p>
+              </w:tc>
+              <w:tc>
+                <w:tcPr>
+                  <w:tcW w:w="574" w:type="dxa"/>
+                  <w:tcBorders>
+                    <w:left w:val="nil"/>
+                    <w:right w:val="nil"/>
+                  </w:tcBorders>
+                  <w:shd w:val="clear" w:color="auto" w:fill="F2F2F2" w:themeFill="background1" w:themeFillShade="F2"/>
+                  <w:vAlign w:val="center"/>
+                </w:tcPr>
+                <w:p>
+                  <w:pPr>
+                    <w:keepNext/>
+                    <w:keepLines/>
+                    <w:pStyle w:val="NormalWeb"/>
+                    <w:spacing w:before="0" w:beforeAutospacing="0" w:after="0" w:afterAutospacing="0"/>
+                    <w:rPr>
+                      <w:rFonts w:asciiTheme="majorHAnsi" w:hAnsiTheme="majorHAnsi" w:cstheme="majorHAnsi"/>
+                      <w:b/>
+                      <w:bCs/>
+                      <w:sz w:val="16"/>
+                      <w:szCs w:val="16"/>
+                    </w:rPr>
+                  </w:pPr>
+                  <w:r>
+                    <w:rPr>
+                      <w:rFonts w:asciiTheme="majorHAnsi" w:hAnsiTheme="majorHAnsi" w:cstheme="majorHAnsi"/>
+                      <w:b/>
+                      <w:bCs/>
+                      <w:sz w:val="16"/>
+                      <w:szCs w:val="16"/>
+                    </w:rPr>
+                    <w:t>Area</w:t>
+                  </w:r>
+                  <w:r>
+                    <w:rPr>
+                      <w:rFonts w:asciiTheme="majorHAnsi" w:hAnsiTheme="majorHAnsi" w:cstheme="majorHAnsi"/>
+                      <w:b/>
+                      <w:bCs/>
+                      <w:sz w:val="16"/>
+                      <w:szCs w:val="16"/>
+                    </w:rPr>
+                    <w:t>:</w:t>
+                  </w:r>
+                </w:p>
+              </w:tc>
+              <w:tc>
+                <w:tcPr>
+                  <w:tcW w:w="1699" w:type="dxa"/>
+                  <w:tcBorders>
+                    <w:left w:val="nil"/>
+                    <w:right w:val="nil"/>
+                  </w:tcBorders>
+                  <w:shd w:val="clear" w:color="auto" w:fill="F2F2F2" w:themeFill="background1" w:themeFillShade="F2"/>
+                  <w:vAlign w:val="center"/>
+                </w:tcPr>
+                <w:p>
+                  <w:pPr>
+                    <w:keepNext/>
+                    <w:keepLines/>
+                    <w:rPr>
+                      <w:rFonts w:asciiTheme="majorHAnsi" w:hAnsiTheme="majorHAnsi" w:cstheme="majorHAnsi"/>
+                      <w:color w:val="000000"/>
+                      <w:sz w:val="16"/>
+                      <w:szCs w:val="16"/>
+                    </w:rPr>
+                  </w:pPr>
+                  <w:r>
+                    <w:rPr>
+                      <w:rFonts w:asciiTheme="majorHAnsi" w:hAnsiTheme="majorHAnsi" w:cstheme="majorHAnsi"/>
+                      <w:color w:val="000000"/>
+                      <w:sz w:val="16"/>
+                      <w:szCs w:val="16"/>
+                    </w:rPr>
+                    <w:t>{area}</w:t>
+                  </w:r>
+                </w:p>
+              </w:tc>
+            </w:tr>
+            <w:tr>
+              <w:trPr>
+                <w:cantSplit/>
+                <w:trHeight w:val="1720" w:hRule="exact"/>
+              </w:trPr>
+              <w:tc>
+                <w:tcPr>
+                  <w:tcW w:w="1707" w:type="dxa"/>
+                  <w:gridSpan w:val="3"/>
+                  <w:vAlign w:val="center"/>
+                </w:tcPr>
+                <w:p>
+                  <w:pPr>
+                    <w:jc w:val="center"/>
+                    <w:rPr>
+                      <w:rFonts w:asciiTheme="majorHAnsi" w:hAnsiTheme="majorHAnsi" w:cstheme="majorHAnsi"/>
+                      <w:color w:val="000000"/>
+                      <w:sz w:val="16"/>
+                      <w:szCs w:val="16"/>
+                    </w:rPr>
+                  </w:pPr>
+                  <w:r>
+                    <w:rPr>
+                      <w:rFonts w:asciiTheme="majorHAnsi" w:hAnsiTheme="majorHAnsi" w:cstheme="majorHAnsi"/>
+                      <w:color w:val="000000"/>
+                      <w:sz w:val="16"/>
+                      <w:szCs w:val="16"/>
+                    </w:rPr>
+                    <w:t>{%image}</w:t>
+                  </w:r>
+                </w:p>
+              </w:tc>
+              <w:tc>
+                <w:tcPr>
+                  <w:tcW w:w="1699" w:type="dxa"/>
+                  <w:tcBorders>
+                    <w:right w:val="nil"/>
+                  </w:tcBorders>
+                  <w:vAlign w:val="center"/>
+                </w:tcPr>
+                <w:p>
+                  <w:pPr>
+                    <w:rPr>
+                      <w:rFonts w:asciiTheme="majorHAnsi" w:hAnsiTheme="majorHAnsi" w:cstheme="majorHAnsi"/>
+                      <w:color w:val="000000"/>
+                      <w:sz w:val="16"/>
+                      <w:szCs w:val="16"/>
+                    </w:rPr>
+                  </w:pPr>
+                  <w:r>
+                    <w:rPr>
+                      <w:rFonts w:asciiTheme="majorHAnsi" w:hAnsiTheme="majorHAnsi" w:cstheme="majorHAnsi"/>
+                      <w:color w:val="000000"/>
+                      <w:sz w:val="16"/>
+                      <w:szCs w:val="16"/>
+                    </w:rPr>
+                    <w:t>{comment}</w:t>
+                  </w:r>
+                </w:p>
+              </w:tc>
+            </w:tr>
+          </w:tbl>
           <w:p>
-            <w:pPr>
-              <w:keepNext/>
-              <w:keepLines/>
-              <w:rPr>
-                <w:rFonts w:asciiTheme="majorHAnsi" w:hAnsiTheme="majorHAnsi" w:cstheme="majorHAnsi"/>
-                <w:color w:val="000000"/>
-                <w:sz w:val="16"/>
-                <w:szCs w:val="16"/>
-              </w:rPr>
-            </w:pPr>
             <w:r>
-              <w:rPr>
-                <w:rFonts w:asciiTheme="majorHAnsi" w:hAnsiTheme="majorHAnsi" w:cstheme="majorHAnsi"/>
-                <w:color w:val="000000"/>
-                <w:sz w:val="16"/>
-                <w:szCs w:val="16"/>
-              </w:rPr>
-              <w:t>{number}</w:t>
-            </w:r>
-          </w:p>
-        </w:tc>
-        <w:tc>
-          <w:tcPr>
-            <w:tcW w:w="574" w:type="dxa"/>
-            <w:tcBorders>
-              <w:left w:val="nil"/>
-              <w:right w:val="nil"/>
-            </w:tcBorders>
-            <w:shd w:val="clear" w:color="auto" w:fill="F2F2F2" w:themeFill="background1" w:themeFillShade="F2"/>
-            <w:vAlign w:val="center"/>
-          </w:tcPr>
-          <w:p>
-            <w:pPr>
-              <w:keepNext/>
-              <w:keepLines/>
-              <w:pStyle w:val="NormalWeb"/>
-              <w:spacing w:before="0" w:beforeAutospacing="0" w:after="0" w:afterAutospacing="0"/>
-              <w:rPr>
-                <w:rFonts w:asciiTheme="majorHAnsi" w:hAnsiTheme="majorHAnsi" w:cstheme="majorHAnsi"/>
-                <w:b/>
-                <w:bCs/>
-                <w:sz w:val="16"/>
-                <w:szCs w:val="16"/>
-              </w:rPr>
-            </w:pPr>
-            <w:r>
-              <w:rPr>
-                <w:rFonts w:asciiTheme="majorHAnsi" w:hAnsiTheme="majorHAnsi" w:cstheme="majorHAnsi"/>
-                <w:b/>
-                <w:bCs/>
-                <w:sz w:val="16"/>
-                <w:szCs w:val="16"/>
-              </w:rPr>
-              <w:t>Area</w:t>
-            </w:r>
-            <w:r>
-              <w:rPr>
-                <w:rFonts w:asciiTheme="majorHAnsi" w:hAnsiTheme="majorHAnsi" w:cstheme="majorHAnsi"/>
-                <w:b/>
-                <w:bCs/>
-                <w:sz w:val="16"/>
-                <w:szCs w:val="16"/>
-              </w:rPr>
-              <w:t>:</w:t>
-            </w:r>
-          </w:p>
-        </w:tc>
-        <w:tc>
-          <w:tcPr>
-            <w:tcW w:w="1699" w:type="dxa"/>
-            <w:tcBorders>
-              <w:left w:val="nil"/>
-              <w:right w:val="nil"/>
-            </w:tcBorders>
-            <w:shd w:val="clear" w:color="auto" w:fill="F2F2F2" w:themeFill="background1" w:themeFillShade="F2"/>
-            <w:vAlign w:val="center"/>
-          </w:tcPr>
-          <w:p>
-            <w:pPr>
-              <w:keepNext/>
-              <w:keepLines/>
-              <w:rPr>
-                <w:rFonts w:asciiTheme="majorHAnsi" w:hAnsiTheme="majorHAnsi" w:cstheme="majorHAnsi"/>
-                <w:color w:val="000000"/>
-                <w:sz w:val="16"/>
-                <w:szCs w:val="16"/>
-              </w:rPr>
-            </w:pPr>
-            <w:r>
-              <w:rPr>
-                <w:rFonts w:asciiTheme="majorHAnsi" w:hAnsiTheme="majorHAnsi" w:cstheme="majorHAnsi"/>
-                <w:color w:val="000000"/>
-                <w:sz w:val="16"/>
-                <w:szCs w:val="16"/>
-              </w:rPr>
-              <w:t>{area}</w:t>
-            </w:r>
-          </w:p>
-        </w:tc>
-      </w:tr>
-      <w:tr>
-        <w:trPr>
-          <w:cantSplit/>
-          <w:trHeight w:val="1720" w:hRule="exact"/>
-        </w:trPr>
-        <w:tc>
-          <w:tcPr>
-            <w:tcW w:w="1707" w:type="dxa"/>
-            <w:gridSpan w:val="3"/>
-            <w:vAlign w:val="center"/>
-          </w:tcPr>
-          <w:p>
-            <w:pPr>
-              <w:jc w:val="center"/>
-              <w:rPr>
-                <w:rFonts w:asciiTheme="majorHAnsi" w:hAnsiTheme="majorHAnsi" w:cstheme="majorHAnsi"/>
-                <w:color w:val="000000"/>
-                <w:sz w:val="16"/>
-                <w:szCs w:val="16"/>
-              </w:rPr>
-            </w:pPr>
-            <w:r>
-              <w:rPr>
-                <w:rFonts w:asciiTheme="majorHAnsi" w:hAnsiTheme="majorHAnsi" w:cstheme="majorHAnsi"/>
-                <w:color w:val="000000"/>
-                <w:sz w:val="16"/>
-                <w:szCs w:val="16"/>
-              </w:rPr>
-              <w:t>{%image}</w:t>
-            </w:r>
-          </w:p>
-        </w:tc>
-        <w:tc>
-          <w:tcPr>
-            <w:tcW w:w="1699" w:type="dxa"/>
-            <w:tcBorders>
-              <w:right w:val="nil"/>
-            </w:tcBorders>
-            <w:vAlign w:val="center"/>
-          </w:tcPr>
-          <w:p>
-            <w:pPr>
-              <w:rPr>
-                <w:rFonts w:asciiTheme="majorHAnsi" w:hAnsiTheme="majorHAnsi" w:cstheme="majorHAnsi"/>
-                <w:color w:val="000000"/>
-                <w:sz w:val="16"/>
-                <w:szCs w:val="16"/>
-              </w:rPr>
-            </w:pPr>
-            <w:r>
-              <w:rPr>
-                <w:rFonts w:asciiTheme="majorHAnsi" w:hAnsiTheme="majorHAnsi" w:cstheme="majorHAnsi"/>
-                <w:color w:val="000000"/>
-                <w:sz w:val="16"/>
-                <w:szCs w:val="16"/>
-              </w:rPr>
-              <w:t>{comment}</w:t>
+              <w:t>{/.}{/photo_rows}</w:t>
             </w:r>
           </w:p>
         </w:tc>
       </w:tr>
     </w:tbl>
-    <w:p/>
-    <w:p>
-      <w:r>
-        <w:t>{/report_photos}</w:t>
-      </w:r>
-    </w:p>
     <w:p/>
     <w:p/>
     <w:p/>

</xml_diff>

<commit_message>
fix: photo grid still wasn't row-major -- fixed the wrong section break
The previous fix removed the 3-column setting from the sectPr *before*
the report_photos loop, but in OOXML a section's properties live in
the sectPr at its end, not its start -- so the loop was still trapped
in the real 3-column section further down, which is why item 4's
header and photo ended up split across columns. This targets the
correct sectPr (the one immediately after {/report_photos}).
</commit_message>
<xml_diff>
--- a/src/templates/council-inspection.docx
+++ b/src/templates/council-inspection.docx
@@ -862,7 +862,7 @@
           <w:type w:val="nextPage"/>
           <w:pgSz w:w="11900" w:h="16840"/>
           <w:pgMar w:top="720" w:right="720" w:bottom="720" w:left="720" w:header="705" w:footer="335" w:gutter="0"/>
-          <w:cols w:space="113"/>
+          <w:cols w:num="3" w:space="113"/>
           <w:docGrid w:linePitch="326"/>
         </w:sectPr>
       </w:pPr>
@@ -1401,7 +1401,7 @@
           <w:type w:val="continuous"/>
           <w:pgSz w:w="11900" w:h="16840"/>
           <w:pgMar w:top="720" w:right="720" w:bottom="720" w:left="720" w:header="705" w:footer="335" w:gutter="0"/>
-          <w:cols w:num="3" w:space="113"/>
+          <w:cols w:space="113"/>
           <w:docGrid w:linePitch="326"/>
         </w:sectPr>
       </w:pPr>

</xml_diff>

<commit_message>
fill row by row, not column
</commit_message>
<xml_diff>
--- a/src/templates/council-inspection.docx
+++ b/src/templates/council-inspection.docx
@@ -862,14 +862,30 @@
           <w:type w:val="nextPage"/>
           <w:pgSz w:w="11900" w:h="16840"/>
           <w:pgMar w:top="720" w:right="720" w:bottom="720" w:left="720" w:header="705" w:footer="335" w:gutter="0"/>
-          <w:cols w:num="3" w:space="113"/>
+          <w:cols w:space="113"/>
           <w:docGrid w:linePitch="326"/>
         </w:sectPr>
       </w:pPr>
+    </w:p>
+    <w:p>
+      <w:pPr>
+        <w:spacing w:after="0" w:line="240" w:lineRule="auto"/>
+        <w:rPr>
+          <w:sz w:val="2"/>
+          <w:szCs w:val="2"/>
+        </w:rPr>
+      </w:pPr>
+      <w:r>
+        <w:rPr>
+          <w:sz w:val="2"/>
+          <w:szCs w:val="2"/>
+        </w:rPr>
+        <w:t>{#photo_rows}</w:t>
+      </w:r>
     </w:p>
     <w:tbl>
       <w:tblPr>
-        <w:tblW w:w="0" w:type="auto"/>
+        <w:tblW w:w="10458" w:type="dxa"/>
         <w:tblBorders>
           <w:top w:val="none" w:sz="0" w:space="0" w:color="auto"/>
           <w:left w:val="none" w:sz="0" w:space="0" w:color="auto"/>
@@ -878,22 +894,41 @@
           <w:insideH w:val="none" w:sz="0" w:space="0" w:color="auto"/>
           <w:insideV w:val="none" w:sz="0" w:space="0" w:color="auto"/>
         </w:tblBorders>
+        <w:tblLayout w:type="fixed"/>
+        <w:tblCellMar>
+          <w:left w:w="0" w:type="dxa"/>
+          <w:right w:w="0" w:type="dxa"/>
+        </w:tblCellMar>
         <w:tblLook w:val="0000" w:firstRow="0" w:lastRow="0" w:firstColumn="0" w:lastColumn="0" w:noHBand="1" w:noVBand="1"/>
       </w:tblPr>
       <w:tblGrid>
-        <w:gridCol w:w="3406"/>
-        <w:gridCol w:w="3406"/>
-        <w:gridCol w:w="3406"/>
+        <w:gridCol w:w="3486"/>
+        <w:gridCol w:w="3486"/>
+        <w:gridCol w:w="3486"/>
       </w:tblGrid>
       <w:tr>
+        <w:trPr>
+          <w:cantSplit/>
+        </w:trPr>
         <w:tc>
           <w:tcPr>
-            <w:tcW w:w="3406" w:type="dxa"/>
+            <w:tcW w:w="3486" w:type="dxa"/>
             <w:vAlign w:val="top"/>
           </w:tcPr>
           <w:p>
+            <w:pPr>
+              <w:spacing w:after="0" w:line="240" w:lineRule="auto"/>
+              <w:rPr>
+                <w:sz w:val="2"/>
+                <w:szCs w:val="2"/>
+              </w:rPr>
+            </w:pPr>
             <w:r>
-              <w:t>{#photo_rows}{#.}</w:t>
+              <w:rPr>
+                <w:sz w:val="2"/>
+                <w:szCs w:val="2"/>
+              </w:rPr>
+              <w:t>{#c1}</w:t>
             </w:r>
           </w:p>
           <w:tbl>
@@ -1140,36 +1175,638 @@
             </w:tr>
           </w:tbl>
           <w:p>
+            <w:pPr>
+              <w:spacing w:after="0" w:line="240" w:lineRule="auto"/>
+              <w:rPr>
+                <w:sz w:val="2"/>
+                <w:szCs w:val="2"/>
+              </w:rPr>
+            </w:pPr>
             <w:r>
-              <w:t>{/.}{/photo_rows}</w:t>
+              <w:rPr>
+                <w:sz w:val="2"/>
+                <w:szCs w:val="2"/>
+              </w:rPr>
+              <w:t>{/c1}</w:t>
+            </w:r>
+          </w:p>
+          <w:p>
+            <w:pPr>
+              <w:spacing w:after="0" w:line="240" w:lineRule="auto"/>
+              <w:rPr>
+                <w:sz w:val="2"/>
+                <w:szCs w:val="2"/>
+              </w:rPr>
+            </w:pPr>
+            <w:r>
+              <w:rPr>
+                <w:sz w:val="2"/>
+                <w:szCs w:val="2"/>
+              </w:rPr>
+              <w:t/>
+            </w:r>
+          </w:p>
+        </w:tc>
+        <w:tc>
+          <w:tcPr>
+            <w:tcW w:w="3486" w:type="dxa"/>
+            <w:vAlign w:val="top"/>
+          </w:tcPr>
+          <w:p>
+            <w:pPr>
+              <w:spacing w:after="0" w:line="240" w:lineRule="auto"/>
+              <w:rPr>
+                <w:sz w:val="2"/>
+                <w:szCs w:val="2"/>
+              </w:rPr>
+            </w:pPr>
+            <w:r>
+              <w:rPr>
+                <w:sz w:val="2"/>
+                <w:szCs w:val="2"/>
+              </w:rPr>
+              <w:t>{#c2}</w:t>
+            </w:r>
+          </w:p>
+          <w:tbl>
+            <w:tblPr>
+              <w:tblStyle w:val="TableGrid"/>
+              <w:tblW w:w="0" w:type="auto"/>
+              <w:tblBorders>
+                <w:top w:val="single" w:sz="4" w:space="0" w:color="A6A6A6" w:themeColor="background1" w:themeShade="A6"/>
+                <w:left w:val="single" w:sz="4" w:space="0" w:color="A6A6A6" w:themeColor="background1" w:themeShade="A6"/>
+                <w:bottom w:val="single" w:sz="4" w:space="0" w:color="A6A6A6" w:themeColor="background1" w:themeShade="A6"/>
+                <w:right w:val="single" w:sz="4" w:space="0" w:color="A6A6A6" w:themeColor="background1" w:themeShade="A6"/>
+                <w:insideH w:val="single" w:sz="4" w:space="0" w:color="A6A6A6" w:themeColor="background1" w:themeShade="A6"/>
+                <w:insideV w:val="single" w:sz="4" w:space="0" w:color="A6A6A6" w:themeColor="background1" w:themeShade="A6"/>
+              </w:tblBorders>
+              <w:tblLook w:val="04A0" w:firstRow="1" w:lastRow="0" w:firstColumn="1" w:lastColumn="0" w:noHBand="0" w:noVBand="1"/>
+            </w:tblPr>
+            <w:tblGrid>
+              <w:gridCol w:w="675"/>
+              <w:gridCol w:w="458"/>
+              <w:gridCol w:w="574"/>
+              <w:gridCol w:w="1699"/>
+            </w:tblGrid>
+            <w:tr>
+              <w:trPr>
+                <w:cantSplit/>
+                <w:trHeight w:val="397" w:hRule="exact"/>
+              </w:trPr>
+              <w:tc>
+                <w:tcPr>
+                  <w:tcW w:w="675" w:type="dxa"/>
+                  <w:tcBorders>
+                    <w:right w:val="nil"/>
+                  </w:tcBorders>
+                  <w:shd w:val="clear" w:color="auto" w:fill="F2F2F2" w:themeFill="background1" w:themeFillShade="F2"/>
+                  <w:vAlign w:val="center"/>
+                </w:tcPr>
+                <w:p>
+                  <w:pPr>
+                    <w:keepNext/>
+                    <w:keepLines/>
+                    <w:pStyle w:val="NormalWeb"/>
+                    <w:spacing w:before="0" w:beforeAutospacing="0" w:after="0" w:afterAutospacing="0"/>
+                    <w:rPr>
+                      <w:rFonts w:asciiTheme="majorHAnsi" w:hAnsiTheme="majorHAnsi" w:cstheme="majorHAnsi"/>
+                      <w:b/>
+                      <w:bCs/>
+                      <w:sz w:val="16"/>
+                      <w:szCs w:val="16"/>
+                    </w:rPr>
+                  </w:pPr>
+                  <w:r>
+                    <w:rPr>
+                      <w:rFonts w:asciiTheme="majorHAnsi" w:hAnsiTheme="majorHAnsi" w:cstheme="majorHAnsi"/>
+                      <w:b/>
+                      <w:bCs/>
+                      <w:sz w:val="16"/>
+                      <w:szCs w:val="16"/>
+                    </w:rPr>
+                    <w:t>Image</w:t>
+                  </w:r>
+                  <w:r>
+                    <w:rPr>
+                      <w:rFonts w:asciiTheme="majorHAnsi" w:hAnsiTheme="majorHAnsi" w:cstheme="majorHAnsi"/>
+                      <w:b/>
+                      <w:bCs/>
+                      <w:sz w:val="16"/>
+                      <w:szCs w:val="16"/>
+                    </w:rPr>
+                    <w:t>:</w:t>
+                  </w:r>
+                </w:p>
+              </w:tc>
+              <w:tc>
+                <w:tcPr>
+                  <w:tcW w:w="458" w:type="dxa"/>
+                  <w:tcBorders>
+                    <w:left w:val="nil"/>
+                    <w:right w:val="nil"/>
+                  </w:tcBorders>
+                  <w:shd w:val="clear" w:color="auto" w:fill="F2F2F2" w:themeFill="background1" w:themeFillShade="F2"/>
+                  <w:vAlign w:val="center"/>
+                </w:tcPr>
+                <w:p>
+                  <w:pPr>
+                    <w:keepNext/>
+                    <w:keepLines/>
+                    <w:rPr>
+                      <w:rFonts w:asciiTheme="majorHAnsi" w:hAnsiTheme="majorHAnsi" w:cstheme="majorHAnsi"/>
+                      <w:color w:val="000000"/>
+                      <w:sz w:val="16"/>
+                      <w:szCs w:val="16"/>
+                    </w:rPr>
+                  </w:pPr>
+                  <w:r>
+                    <w:rPr>
+                      <w:rFonts w:asciiTheme="majorHAnsi" w:hAnsiTheme="majorHAnsi" w:cstheme="majorHAnsi"/>
+                      <w:color w:val="000000"/>
+                      <w:sz w:val="16"/>
+                      <w:szCs w:val="16"/>
+                    </w:rPr>
+                    <w:t>{number}</w:t>
+                  </w:r>
+                </w:p>
+              </w:tc>
+              <w:tc>
+                <w:tcPr>
+                  <w:tcW w:w="574" w:type="dxa"/>
+                  <w:tcBorders>
+                    <w:left w:val="nil"/>
+                    <w:right w:val="nil"/>
+                  </w:tcBorders>
+                  <w:shd w:val="clear" w:color="auto" w:fill="F2F2F2" w:themeFill="background1" w:themeFillShade="F2"/>
+                  <w:vAlign w:val="center"/>
+                </w:tcPr>
+                <w:p>
+                  <w:pPr>
+                    <w:keepNext/>
+                    <w:keepLines/>
+                    <w:pStyle w:val="NormalWeb"/>
+                    <w:spacing w:before="0" w:beforeAutospacing="0" w:after="0" w:afterAutospacing="0"/>
+                    <w:rPr>
+                      <w:rFonts w:asciiTheme="majorHAnsi" w:hAnsiTheme="majorHAnsi" w:cstheme="majorHAnsi"/>
+                      <w:b/>
+                      <w:bCs/>
+                      <w:sz w:val="16"/>
+                      <w:szCs w:val="16"/>
+                    </w:rPr>
+                  </w:pPr>
+                  <w:r>
+                    <w:rPr>
+                      <w:rFonts w:asciiTheme="majorHAnsi" w:hAnsiTheme="majorHAnsi" w:cstheme="majorHAnsi"/>
+                      <w:b/>
+                      <w:bCs/>
+                      <w:sz w:val="16"/>
+                      <w:szCs w:val="16"/>
+                    </w:rPr>
+                    <w:t>Area</w:t>
+                  </w:r>
+                  <w:r>
+                    <w:rPr>
+                      <w:rFonts w:asciiTheme="majorHAnsi" w:hAnsiTheme="majorHAnsi" w:cstheme="majorHAnsi"/>
+                      <w:b/>
+                      <w:bCs/>
+                      <w:sz w:val="16"/>
+                      <w:szCs w:val="16"/>
+                    </w:rPr>
+                    <w:t>:</w:t>
+                  </w:r>
+                </w:p>
+              </w:tc>
+              <w:tc>
+                <w:tcPr>
+                  <w:tcW w:w="1699" w:type="dxa"/>
+                  <w:tcBorders>
+                    <w:left w:val="nil"/>
+                    <w:right w:val="nil"/>
+                  </w:tcBorders>
+                  <w:shd w:val="clear" w:color="auto" w:fill="F2F2F2" w:themeFill="background1" w:themeFillShade="F2"/>
+                  <w:vAlign w:val="center"/>
+                </w:tcPr>
+                <w:p>
+                  <w:pPr>
+                    <w:keepNext/>
+                    <w:keepLines/>
+                    <w:rPr>
+                      <w:rFonts w:asciiTheme="majorHAnsi" w:hAnsiTheme="majorHAnsi" w:cstheme="majorHAnsi"/>
+                      <w:color w:val="000000"/>
+                      <w:sz w:val="16"/>
+                      <w:szCs w:val="16"/>
+                    </w:rPr>
+                  </w:pPr>
+                  <w:r>
+                    <w:rPr>
+                      <w:rFonts w:asciiTheme="majorHAnsi" w:hAnsiTheme="majorHAnsi" w:cstheme="majorHAnsi"/>
+                      <w:color w:val="000000"/>
+                      <w:sz w:val="16"/>
+                      <w:szCs w:val="16"/>
+                    </w:rPr>
+                    <w:t>{area}</w:t>
+                  </w:r>
+                </w:p>
+              </w:tc>
+            </w:tr>
+            <w:tr>
+              <w:trPr>
+                <w:cantSplit/>
+                <w:trHeight w:val="1720" w:hRule="exact"/>
+              </w:trPr>
+              <w:tc>
+                <w:tcPr>
+                  <w:tcW w:w="1707" w:type="dxa"/>
+                  <w:gridSpan w:val="3"/>
+                  <w:vAlign w:val="center"/>
+                </w:tcPr>
+                <w:p>
+                  <w:pPr>
+                    <w:jc w:val="center"/>
+                    <w:rPr>
+                      <w:rFonts w:asciiTheme="majorHAnsi" w:hAnsiTheme="majorHAnsi" w:cstheme="majorHAnsi"/>
+                      <w:color w:val="000000"/>
+                      <w:sz w:val="16"/>
+                      <w:szCs w:val="16"/>
+                    </w:rPr>
+                  </w:pPr>
+                  <w:r>
+                    <w:rPr>
+                      <w:rFonts w:asciiTheme="majorHAnsi" w:hAnsiTheme="majorHAnsi" w:cstheme="majorHAnsi"/>
+                      <w:color w:val="000000"/>
+                      <w:sz w:val="16"/>
+                      <w:szCs w:val="16"/>
+                    </w:rPr>
+                    <w:t>{%image}</w:t>
+                  </w:r>
+                </w:p>
+              </w:tc>
+              <w:tc>
+                <w:tcPr>
+                  <w:tcW w:w="1699" w:type="dxa"/>
+                  <w:tcBorders>
+                    <w:right w:val="nil"/>
+                  </w:tcBorders>
+                  <w:vAlign w:val="center"/>
+                </w:tcPr>
+                <w:p>
+                  <w:pPr>
+                    <w:rPr>
+                      <w:rFonts w:asciiTheme="majorHAnsi" w:hAnsiTheme="majorHAnsi" w:cstheme="majorHAnsi"/>
+                      <w:color w:val="000000"/>
+                      <w:sz w:val="16"/>
+                      <w:szCs w:val="16"/>
+                    </w:rPr>
+                  </w:pPr>
+                  <w:r>
+                    <w:rPr>
+                      <w:rFonts w:asciiTheme="majorHAnsi" w:hAnsiTheme="majorHAnsi" w:cstheme="majorHAnsi"/>
+                      <w:color w:val="000000"/>
+                      <w:sz w:val="16"/>
+                      <w:szCs w:val="16"/>
+                    </w:rPr>
+                    <w:t>{comment}</w:t>
+                  </w:r>
+                </w:p>
+              </w:tc>
+            </w:tr>
+          </w:tbl>
+          <w:p>
+            <w:pPr>
+              <w:spacing w:after="0" w:line="240" w:lineRule="auto"/>
+              <w:rPr>
+                <w:sz w:val="2"/>
+                <w:szCs w:val="2"/>
+              </w:rPr>
+            </w:pPr>
+            <w:r>
+              <w:rPr>
+                <w:sz w:val="2"/>
+                <w:szCs w:val="2"/>
+              </w:rPr>
+              <w:t>{/c2}</w:t>
+            </w:r>
+          </w:p>
+          <w:p>
+            <w:pPr>
+              <w:spacing w:after="0" w:line="240" w:lineRule="auto"/>
+              <w:rPr>
+                <w:sz w:val="2"/>
+                <w:szCs w:val="2"/>
+              </w:rPr>
+            </w:pPr>
+            <w:r>
+              <w:rPr>
+                <w:sz w:val="2"/>
+                <w:szCs w:val="2"/>
+              </w:rPr>
+              <w:t/>
+            </w:r>
+          </w:p>
+        </w:tc>
+        <w:tc>
+          <w:tcPr>
+            <w:tcW w:w="3486" w:type="dxa"/>
+            <w:vAlign w:val="top"/>
+          </w:tcPr>
+          <w:p>
+            <w:pPr>
+              <w:spacing w:after="0" w:line="240" w:lineRule="auto"/>
+              <w:rPr>
+                <w:sz w:val="2"/>
+                <w:szCs w:val="2"/>
+              </w:rPr>
+            </w:pPr>
+            <w:r>
+              <w:rPr>
+                <w:sz w:val="2"/>
+                <w:szCs w:val="2"/>
+              </w:rPr>
+              <w:t>{#c3}</w:t>
+            </w:r>
+          </w:p>
+          <w:tbl>
+            <w:tblPr>
+              <w:tblStyle w:val="TableGrid"/>
+              <w:tblW w:w="0" w:type="auto"/>
+              <w:tblBorders>
+                <w:top w:val="single" w:sz="4" w:space="0" w:color="A6A6A6" w:themeColor="background1" w:themeShade="A6"/>
+                <w:left w:val="single" w:sz="4" w:space="0" w:color="A6A6A6" w:themeColor="background1" w:themeShade="A6"/>
+                <w:bottom w:val="single" w:sz="4" w:space="0" w:color="A6A6A6" w:themeColor="background1" w:themeShade="A6"/>
+                <w:right w:val="single" w:sz="4" w:space="0" w:color="A6A6A6" w:themeColor="background1" w:themeShade="A6"/>
+                <w:insideH w:val="single" w:sz="4" w:space="0" w:color="A6A6A6" w:themeColor="background1" w:themeShade="A6"/>
+                <w:insideV w:val="single" w:sz="4" w:space="0" w:color="A6A6A6" w:themeColor="background1" w:themeShade="A6"/>
+              </w:tblBorders>
+              <w:tblLook w:val="04A0" w:firstRow="1" w:lastRow="0" w:firstColumn="1" w:lastColumn="0" w:noHBand="0" w:noVBand="1"/>
+            </w:tblPr>
+            <w:tblGrid>
+              <w:gridCol w:w="675"/>
+              <w:gridCol w:w="458"/>
+              <w:gridCol w:w="574"/>
+              <w:gridCol w:w="1699"/>
+            </w:tblGrid>
+            <w:tr>
+              <w:trPr>
+                <w:cantSplit/>
+                <w:trHeight w:val="397" w:hRule="exact"/>
+              </w:trPr>
+              <w:tc>
+                <w:tcPr>
+                  <w:tcW w:w="675" w:type="dxa"/>
+                  <w:tcBorders>
+                    <w:right w:val="nil"/>
+                  </w:tcBorders>
+                  <w:shd w:val="clear" w:color="auto" w:fill="F2F2F2" w:themeFill="background1" w:themeFillShade="F2"/>
+                  <w:vAlign w:val="center"/>
+                </w:tcPr>
+                <w:p>
+                  <w:pPr>
+                    <w:keepNext/>
+                    <w:keepLines/>
+                    <w:pStyle w:val="NormalWeb"/>
+                    <w:spacing w:before="0" w:beforeAutospacing="0" w:after="0" w:afterAutospacing="0"/>
+                    <w:rPr>
+                      <w:rFonts w:asciiTheme="majorHAnsi" w:hAnsiTheme="majorHAnsi" w:cstheme="majorHAnsi"/>
+                      <w:b/>
+                      <w:bCs/>
+                      <w:sz w:val="16"/>
+                      <w:szCs w:val="16"/>
+                    </w:rPr>
+                  </w:pPr>
+                  <w:r>
+                    <w:rPr>
+                      <w:rFonts w:asciiTheme="majorHAnsi" w:hAnsiTheme="majorHAnsi" w:cstheme="majorHAnsi"/>
+                      <w:b/>
+                      <w:bCs/>
+                      <w:sz w:val="16"/>
+                      <w:szCs w:val="16"/>
+                    </w:rPr>
+                    <w:t>Image</w:t>
+                  </w:r>
+                  <w:r>
+                    <w:rPr>
+                      <w:rFonts w:asciiTheme="majorHAnsi" w:hAnsiTheme="majorHAnsi" w:cstheme="majorHAnsi"/>
+                      <w:b/>
+                      <w:bCs/>
+                      <w:sz w:val="16"/>
+                      <w:szCs w:val="16"/>
+                    </w:rPr>
+                    <w:t>:</w:t>
+                  </w:r>
+                </w:p>
+              </w:tc>
+              <w:tc>
+                <w:tcPr>
+                  <w:tcW w:w="458" w:type="dxa"/>
+                  <w:tcBorders>
+                    <w:left w:val="nil"/>
+                    <w:right w:val="nil"/>
+                  </w:tcBorders>
+                  <w:shd w:val="clear" w:color="auto" w:fill="F2F2F2" w:themeFill="background1" w:themeFillShade="F2"/>
+                  <w:vAlign w:val="center"/>
+                </w:tcPr>
+                <w:p>
+                  <w:pPr>
+                    <w:keepNext/>
+                    <w:keepLines/>
+                    <w:rPr>
+                      <w:rFonts w:asciiTheme="majorHAnsi" w:hAnsiTheme="majorHAnsi" w:cstheme="majorHAnsi"/>
+                      <w:color w:val="000000"/>
+                      <w:sz w:val="16"/>
+                      <w:szCs w:val="16"/>
+                    </w:rPr>
+                  </w:pPr>
+                  <w:r>
+                    <w:rPr>
+                      <w:rFonts w:asciiTheme="majorHAnsi" w:hAnsiTheme="majorHAnsi" w:cstheme="majorHAnsi"/>
+                      <w:color w:val="000000"/>
+                      <w:sz w:val="16"/>
+                      <w:szCs w:val="16"/>
+                    </w:rPr>
+                    <w:t>{number}</w:t>
+                  </w:r>
+                </w:p>
+              </w:tc>
+              <w:tc>
+                <w:tcPr>
+                  <w:tcW w:w="574" w:type="dxa"/>
+                  <w:tcBorders>
+                    <w:left w:val="nil"/>
+                    <w:right w:val="nil"/>
+                  </w:tcBorders>
+                  <w:shd w:val="clear" w:color="auto" w:fill="F2F2F2" w:themeFill="background1" w:themeFillShade="F2"/>
+                  <w:vAlign w:val="center"/>
+                </w:tcPr>
+                <w:p>
+                  <w:pPr>
+                    <w:keepNext/>
+                    <w:keepLines/>
+                    <w:pStyle w:val="NormalWeb"/>
+                    <w:spacing w:before="0" w:beforeAutospacing="0" w:after="0" w:afterAutospacing="0"/>
+                    <w:rPr>
+                      <w:rFonts w:asciiTheme="majorHAnsi" w:hAnsiTheme="majorHAnsi" w:cstheme="majorHAnsi"/>
+                      <w:b/>
+                      <w:bCs/>
+                      <w:sz w:val="16"/>
+                      <w:szCs w:val="16"/>
+                    </w:rPr>
+                  </w:pPr>
+                  <w:r>
+                    <w:rPr>
+                      <w:rFonts w:asciiTheme="majorHAnsi" w:hAnsiTheme="majorHAnsi" w:cstheme="majorHAnsi"/>
+                      <w:b/>
+                      <w:bCs/>
+                      <w:sz w:val="16"/>
+                      <w:szCs w:val="16"/>
+                    </w:rPr>
+                    <w:t>Area</w:t>
+                  </w:r>
+                  <w:r>
+                    <w:rPr>
+                      <w:rFonts w:asciiTheme="majorHAnsi" w:hAnsiTheme="majorHAnsi" w:cstheme="majorHAnsi"/>
+                      <w:b/>
+                      <w:bCs/>
+                      <w:sz w:val="16"/>
+                      <w:szCs w:val="16"/>
+                    </w:rPr>
+                    <w:t>:</w:t>
+                  </w:r>
+                </w:p>
+              </w:tc>
+              <w:tc>
+                <w:tcPr>
+                  <w:tcW w:w="1699" w:type="dxa"/>
+                  <w:tcBorders>
+                    <w:left w:val="nil"/>
+                    <w:right w:val="nil"/>
+                  </w:tcBorders>
+                  <w:shd w:val="clear" w:color="auto" w:fill="F2F2F2" w:themeFill="background1" w:themeFillShade="F2"/>
+                  <w:vAlign w:val="center"/>
+                </w:tcPr>
+                <w:p>
+                  <w:pPr>
+                    <w:keepNext/>
+                    <w:keepLines/>
+                    <w:rPr>
+                      <w:rFonts w:asciiTheme="majorHAnsi" w:hAnsiTheme="majorHAnsi" w:cstheme="majorHAnsi"/>
+                      <w:color w:val="000000"/>
+                      <w:sz w:val="16"/>
+                      <w:szCs w:val="16"/>
+                    </w:rPr>
+                  </w:pPr>
+                  <w:r>
+                    <w:rPr>
+                      <w:rFonts w:asciiTheme="majorHAnsi" w:hAnsiTheme="majorHAnsi" w:cstheme="majorHAnsi"/>
+                      <w:color w:val="000000"/>
+                      <w:sz w:val="16"/>
+                      <w:szCs w:val="16"/>
+                    </w:rPr>
+                    <w:t>{area}</w:t>
+                  </w:r>
+                </w:p>
+              </w:tc>
+            </w:tr>
+            <w:tr>
+              <w:trPr>
+                <w:cantSplit/>
+                <w:trHeight w:val="1720" w:hRule="exact"/>
+              </w:trPr>
+              <w:tc>
+                <w:tcPr>
+                  <w:tcW w:w="1707" w:type="dxa"/>
+                  <w:gridSpan w:val="3"/>
+                  <w:vAlign w:val="center"/>
+                </w:tcPr>
+                <w:p>
+                  <w:pPr>
+                    <w:jc w:val="center"/>
+                    <w:rPr>
+                      <w:rFonts w:asciiTheme="majorHAnsi" w:hAnsiTheme="majorHAnsi" w:cstheme="majorHAnsi"/>
+                      <w:color w:val="000000"/>
+                      <w:sz w:val="16"/>
+                      <w:szCs w:val="16"/>
+                    </w:rPr>
+                  </w:pPr>
+                  <w:r>
+                    <w:rPr>
+                      <w:rFonts w:asciiTheme="majorHAnsi" w:hAnsiTheme="majorHAnsi" w:cstheme="majorHAnsi"/>
+                      <w:color w:val="000000"/>
+                      <w:sz w:val="16"/>
+                      <w:szCs w:val="16"/>
+                    </w:rPr>
+                    <w:t>{%image}</w:t>
+                  </w:r>
+                </w:p>
+              </w:tc>
+              <w:tc>
+                <w:tcPr>
+                  <w:tcW w:w="1699" w:type="dxa"/>
+                  <w:tcBorders>
+                    <w:right w:val="nil"/>
+                  </w:tcBorders>
+                  <w:vAlign w:val="center"/>
+                </w:tcPr>
+                <w:p>
+                  <w:pPr>
+                    <w:rPr>
+                      <w:rFonts w:asciiTheme="majorHAnsi" w:hAnsiTheme="majorHAnsi" w:cstheme="majorHAnsi"/>
+                      <w:color w:val="000000"/>
+                      <w:sz w:val="16"/>
+                      <w:szCs w:val="16"/>
+                    </w:rPr>
+                  </w:pPr>
+                  <w:r>
+                    <w:rPr>
+                      <w:rFonts w:asciiTheme="majorHAnsi" w:hAnsiTheme="majorHAnsi" w:cstheme="majorHAnsi"/>
+                      <w:color w:val="000000"/>
+                      <w:sz w:val="16"/>
+                      <w:szCs w:val="16"/>
+                    </w:rPr>
+                    <w:t>{comment}</w:t>
+                  </w:r>
+                </w:p>
+              </w:tc>
+            </w:tr>
+          </w:tbl>
+          <w:p>
+            <w:pPr>
+              <w:spacing w:after="0" w:line="240" w:lineRule="auto"/>
+              <w:rPr>
+                <w:sz w:val="2"/>
+                <w:szCs w:val="2"/>
+              </w:rPr>
+            </w:pPr>
+            <w:r>
+              <w:rPr>
+                <w:sz w:val="2"/>
+                <w:szCs w:val="2"/>
+              </w:rPr>
+              <w:t>{/c3}</w:t>
+            </w:r>
+          </w:p>
+          <w:p>
+            <w:pPr>
+              <w:spacing w:after="0" w:line="240" w:lineRule="auto"/>
+              <w:rPr>
+                <w:sz w:val="2"/>
+                <w:szCs w:val="2"/>
+              </w:rPr>
+            </w:pPr>
+            <w:r>
+              <w:rPr>
+                <w:sz w:val="2"/>
+                <w:szCs w:val="2"/>
+              </w:rPr>
+              <w:t/>
             </w:r>
           </w:p>
         </w:tc>
       </w:tr>
     </w:tbl>
-    <w:p/>
-    <w:p/>
-    <w:p/>
-    <w:p/>
-    <w:p/>
-    <w:p/>
-    <w:p/>
-    <w:p/>
-    <w:p/>
-    <w:p/>
-    <w:p/>
-    <w:p/>
-    <w:p/>
-    <w:p/>
-    <w:p/>
-    <w:p/>
-    <w:p/>
-    <w:p/>
-    <w:p/>
     <w:p>
       <w:pPr>
-        <w:rPr>
-          <w:rFonts w:asciiTheme="majorHAnsi" w:hAnsiTheme="majorHAnsi" w:cstheme="majorHAnsi"/>
+        <w:spacing w:after="0" w:line="240" w:lineRule="auto"/>
+        <w:rPr>
           <w:sz w:val="16"/>
           <w:szCs w:val="16"/>
         </w:rPr>
@@ -1177,214 +1814,19 @@
     </w:p>
     <w:p>
       <w:pPr>
-        <w:rPr>
-          <w:rFonts w:asciiTheme="majorHAnsi" w:hAnsiTheme="majorHAnsi" w:cstheme="majorHAnsi"/>
-          <w:sz w:val="16"/>
-          <w:szCs w:val="16"/>
-        </w:rPr>
-      </w:pPr>
-    </w:p>
-    <w:p>
-      <w:pPr>
-        <w:rPr>
-          <w:rFonts w:asciiTheme="majorHAnsi" w:hAnsiTheme="majorHAnsi" w:cstheme="majorHAnsi"/>
-          <w:sz w:val="16"/>
-          <w:szCs w:val="16"/>
-        </w:rPr>
-      </w:pPr>
-    </w:p>
-    <w:p>
-      <w:pPr>
-        <w:rPr>
-          <w:rFonts w:asciiTheme="majorHAnsi" w:hAnsiTheme="majorHAnsi" w:cstheme="majorHAnsi"/>
-          <w:sz w:val="16"/>
-          <w:szCs w:val="16"/>
-        </w:rPr>
-      </w:pPr>
-    </w:p>
-    <w:p>
-      <w:pPr>
-        <w:rPr>
-          <w:rFonts w:asciiTheme="majorHAnsi" w:hAnsiTheme="majorHAnsi" w:cstheme="majorHAnsi"/>
-          <w:sz w:val="16"/>
-          <w:szCs w:val="16"/>
-        </w:rPr>
-      </w:pPr>
-    </w:p>
-    <w:p>
-      <w:pPr>
-        <w:rPr>
-          <w:rFonts w:asciiTheme="majorHAnsi" w:hAnsiTheme="majorHAnsi" w:cstheme="majorHAnsi"/>
-          <w:sz w:val="16"/>
-          <w:szCs w:val="16"/>
-        </w:rPr>
-      </w:pPr>
-    </w:p>
-    <w:p>
-      <w:pPr>
-        <w:rPr>
-          <w:rFonts w:asciiTheme="majorHAnsi" w:hAnsiTheme="majorHAnsi" w:cstheme="majorHAnsi"/>
-          <w:sz w:val="16"/>
-          <w:szCs w:val="16"/>
-        </w:rPr>
-      </w:pPr>
-    </w:p>
-    <w:p>
-      <w:pPr>
-        <w:rPr>
-          <w:rFonts w:asciiTheme="majorHAnsi" w:hAnsiTheme="majorHAnsi" w:cstheme="majorHAnsi"/>
-          <w:sz w:val="16"/>
-          <w:szCs w:val="16"/>
-        </w:rPr>
-      </w:pPr>
-    </w:p>
-    <w:p>
-      <w:pPr>
-        <w:rPr>
-          <w:rFonts w:asciiTheme="majorHAnsi" w:hAnsiTheme="majorHAnsi" w:cstheme="majorHAnsi"/>
-          <w:sz w:val="16"/>
-          <w:szCs w:val="16"/>
-        </w:rPr>
-      </w:pPr>
-    </w:p>
-    <w:p>
-      <w:pPr>
-        <w:rPr>
-          <w:rFonts w:asciiTheme="majorHAnsi" w:hAnsiTheme="majorHAnsi" w:cstheme="majorHAnsi"/>
-          <w:sz w:val="16"/>
-          <w:szCs w:val="16"/>
-        </w:rPr>
-      </w:pPr>
-    </w:p>
-    <w:p>
-      <w:pPr>
-        <w:pStyle w:val="NormalWeb"/>
-        <w:spacing w:before="0" w:beforeAutospacing="0" w:after="0" w:afterAutospacing="0"/>
-        <w:rPr>
-          <w:rFonts w:asciiTheme="majorHAnsi" w:hAnsiTheme="majorHAnsi" w:cstheme="majorHAnsi"/>
-          <w:b/>
-          <w:bCs/>
-          <w:sz w:val="16"/>
-          <w:szCs w:val="16"/>
-        </w:rPr>
-      </w:pPr>
-    </w:p>
-    <w:p>
-      <w:pPr>
-        <w:pStyle w:val="NormalWeb"/>
-        <w:spacing w:before="0" w:beforeAutospacing="0" w:after="0" w:afterAutospacing="0"/>
-        <w:rPr>
-          <w:rFonts w:asciiTheme="majorHAnsi" w:hAnsiTheme="majorHAnsi" w:cstheme="majorHAnsi"/>
-          <w:b/>
-          <w:bCs/>
-          <w:sz w:val="16"/>
-          <w:szCs w:val="16"/>
-        </w:rPr>
-      </w:pPr>
-    </w:p>
-    <w:p>
-      <w:pPr>
-        <w:pStyle w:val="NormalWeb"/>
-        <w:spacing w:before="0" w:beforeAutospacing="0" w:after="0" w:afterAutospacing="0"/>
-        <w:rPr>
-          <w:rFonts w:asciiTheme="majorHAnsi" w:hAnsiTheme="majorHAnsi" w:cstheme="majorHAnsi"/>
-          <w:b/>
-          <w:bCs/>
-          <w:sz w:val="16"/>
-          <w:szCs w:val="16"/>
-        </w:rPr>
-      </w:pPr>
-    </w:p>
-    <w:p>
-      <w:pPr>
-        <w:pStyle w:val="NormalWeb"/>
-        <w:spacing w:before="0" w:beforeAutospacing="0" w:after="0" w:afterAutospacing="0"/>
-        <w:rPr>
-          <w:rFonts w:asciiTheme="majorHAnsi" w:hAnsiTheme="majorHAnsi" w:cstheme="majorHAnsi"/>
-          <w:b/>
-          <w:bCs/>
-          <w:sz w:val="16"/>
-          <w:szCs w:val="16"/>
-        </w:rPr>
-      </w:pPr>
-    </w:p>
-    <w:p>
-      <w:pPr>
-        <w:pStyle w:val="NormalWeb"/>
-        <w:spacing w:before="0" w:beforeAutospacing="0" w:after="0" w:afterAutospacing="0"/>
-        <w:rPr>
-          <w:rFonts w:asciiTheme="majorHAnsi" w:hAnsiTheme="majorHAnsi" w:cstheme="majorHAnsi"/>
-          <w:b/>
-          <w:bCs/>
-          <w:sz w:val="16"/>
-          <w:szCs w:val="16"/>
-        </w:rPr>
-      </w:pPr>
-    </w:p>
-    <w:p>
-      <w:pPr>
-        <w:pStyle w:val="NormalWeb"/>
-        <w:spacing w:before="0" w:beforeAutospacing="0" w:after="0" w:afterAutospacing="0"/>
-        <w:rPr>
-          <w:rFonts w:asciiTheme="majorHAnsi" w:hAnsiTheme="majorHAnsi" w:cstheme="majorHAnsi"/>
-          <w:b/>
-          <w:bCs/>
-          <w:sz w:val="16"/>
-          <w:szCs w:val="16"/>
-        </w:rPr>
-      </w:pPr>
-    </w:p>
-    <w:p>
-      <w:pPr>
-        <w:pStyle w:val="NormalWeb"/>
-        <w:spacing w:before="0" w:beforeAutospacing="0" w:after="0" w:afterAutospacing="0"/>
-        <w:rPr>
-          <w:rFonts w:asciiTheme="majorHAnsi" w:hAnsiTheme="majorHAnsi" w:cstheme="majorHAnsi"/>
-          <w:b/>
-          <w:bCs/>
-          <w:sz w:val="16"/>
-          <w:szCs w:val="16"/>
-        </w:rPr>
-      </w:pPr>
-    </w:p>
-    <w:p>
-      <w:pPr>
-        <w:pStyle w:val="NormalWeb"/>
-        <w:spacing w:before="0" w:beforeAutospacing="0" w:after="0" w:afterAutospacing="0"/>
-        <w:rPr>
-          <w:rFonts w:asciiTheme="majorHAnsi" w:hAnsiTheme="majorHAnsi" w:cstheme="majorHAnsi"/>
-          <w:b/>
-          <w:bCs/>
-          <w:sz w:val="16"/>
-          <w:szCs w:val="16"/>
-        </w:rPr>
-      </w:pPr>
-    </w:p>
-    <w:p>
-      <w:pPr>
-        <w:pStyle w:val="NormalWeb"/>
-        <w:spacing w:before="0" w:beforeAutospacing="0" w:after="0" w:afterAutospacing="0"/>
-        <w:rPr>
-          <w:rFonts w:asciiTheme="majorHAnsi" w:hAnsiTheme="majorHAnsi" w:cstheme="majorHAnsi"/>
-          <w:b/>
-          <w:bCs/>
-          <w:sz w:val="16"/>
-          <w:szCs w:val="16"/>
-        </w:rPr>
-      </w:pPr>
-    </w:p>
-    <w:p>
-      <w:pPr>
-        <w:pStyle w:val="NormalWeb"/>
-        <w:spacing w:before="0" w:beforeAutospacing="0" w:after="0" w:afterAutospacing="0"/>
-        <w:rPr>
-          <w:rFonts w:asciiTheme="majorHAnsi" w:hAnsiTheme="majorHAnsi" w:cstheme="majorHAnsi"/>
-          <w:b/>
-          <w:bCs/>
-          <w:sz w:val="16"/>
-          <w:szCs w:val="16"/>
-        </w:rPr>
-      </w:pPr>
+        <w:spacing w:after="0" w:line="240" w:lineRule="auto"/>
+        <w:rPr>
+          <w:sz w:val="2"/>
+          <w:szCs w:val="2"/>
+        </w:rPr>
+      </w:pPr>
+      <w:r>
+        <w:rPr>
+          <w:sz w:val="2"/>
+          <w:szCs w:val="2"/>
+        </w:rPr>
+        <w:t>{/photo_rows}</w:t>
+      </w:r>
     </w:p>
     <w:p>
       <w:pPr>
@@ -2035,7 +2477,7 @@
       <w:type w:val="continuous"/>
       <w:pgSz w:w="11900" w:h="16840"/>
       <w:pgMar w:top="720" w:right="720" w:bottom="720" w:left="720" w:header="705" w:footer="335" w:gutter="0"/>
-      <w:cols w:num="3" w:space="708"/>
+      <w:cols w:space="708"/>
       <w:docGrid w:linePitch="326"/>
     </w:sectPr>
   </w:body>

</xml_diff>

<commit_message>
fix header for different report types
</commit_message>
<xml_diff>
--- a/src/templates/council-inspection.docx
+++ b/src/templates/council-inspection.docx
@@ -2659,7 +2659,7 @@
 </file>
 
 <file path=word/header1.xml><?xml version="1.0" encoding="utf-8"?>
-<w:hdr xmlns:wpc="http://schemas.microsoft.com/office/word/2010/wordprocessingCanvas" xmlns:cx="http://schemas.microsoft.com/office/drawing/2014/chartex" xmlns:cx1="http://schemas.microsoft.com/office/drawing/2015/9/8/chartex" xmlns:cx2="http://schemas.microsoft.com/office/drawing/2015/10/21/chartex" xmlns:cx3="http://schemas.microsoft.com/office/drawing/2016/5/9/chartex" xmlns:cx4="http://schemas.microsoft.com/office/drawing/2016/5/10/chartex" xmlns:cx5="http://schemas.microsoft.com/office/drawing/2016/5/11/chartex" xmlns:cx6="http://schemas.microsoft.com/office/drawing/2016/5/12/chartex" xmlns:cx7="http://schemas.microsoft.com/office/drawing/2016/5/13/chartex" xmlns:cx8="http://schemas.microsoft.com/office/drawing/2016/5/14/chartex" xmlns:mc="http://schemas.openxmlformats.org/markup-compatibility/2006" xmlns:aink="http://schemas.microsoft.com/office/drawing/2016/ink" xmlns:am3d="http://schemas.microsoft.com/office/drawing/2017/model3d" xmlns:o="urn:schemas-microsoft-com:office:office" xmlns:oel="http://schemas.microsoft.com/office/2019/extlst" xmlns:r="http://schemas.openxmlformats.org/officeDocument/2006/relationships" xmlns:m="http://schemas.openxmlformats.org/officeDocument/2006/math" xmlns:v="urn:schemas-microsoft-com:vml" xmlns:wp14="http://schemas.microsoft.com/office/word/2010/wordprocessingDrawing" xmlns:wp="http://schemas.openxmlformats.org/drawingml/2006/wordprocessingDrawing" xmlns:w10="urn:schemas-microsoft-com:office:word" xmlns:w="http://schemas.openxmlformats.org/wordprocessingml/2006/main" xmlns:w14="http://schemas.microsoft.com/office/word/2010/wordml" xmlns:w15="http://schemas.microsoft.com/office/word/2012/wordml" xmlns:w16cex="http://schemas.microsoft.com/office/word/2018/wordml/cex" xmlns:w16cid="http://schemas.microsoft.com/office/word/2016/wordml/cid" xmlns:w16="http://schemas.microsoft.com/office/word/2018/wordml" xmlns:w16du="http://schemas.microsoft.com/office/word/2023/wordml/word16du" xmlns:w16sdtdh="http://schemas.microsoft.com/office/word/2020/wordml/sdtdatahash" xmlns:w16se="http://schemas.microsoft.com/office/word/2015/wordml/symex" xmlns:wpg="http://schemas.microsoft.com/office/word/2010/wordprocessingGroup" xmlns:wpi="http://schemas.microsoft.com/office/word/2010/wordprocessingInk" xmlns:wne="http://schemas.microsoft.com/office/word/2006/wordml" xmlns:wps="http://schemas.microsoft.com/office/word/2010/wordprocessingShape" mc:Ignorable="w14 w15 w16se w16cid w16 w16cex w16sdtdh w16du wp14">
+<w:hdr xmlns:mc="http://schemas.openxmlformats.org/markup-compatibility/2006" xmlns:ns5="http://schemas.openxmlformats.org/drawingml/2006/main" xmlns:ns6="http://schemas.openxmlformats.org/drawingml/2006/picture" xmlns:ns8="http://schemas.microsoft.com/office/drawing/2010/main" xmlns:ns9="http://schemas.microsoft.com/office/mac/drawingml/2011/main" xmlns:r="http://schemas.openxmlformats.org/officeDocument/2006/relationships" xmlns:w="http://schemas.openxmlformats.org/wordprocessingml/2006/main" xmlns:w14="http://schemas.microsoft.com/office/word/2010/wordml" xmlns:wp="http://schemas.openxmlformats.org/drawingml/2006/wordprocessingDrawing" xmlns:wp14="http://schemas.microsoft.com/office/word/2010/wordprocessingDrawing" mc:Ignorable="w14 w15 w16se w16cid w16 w16cex w16sdtdh w16du wp14">
   <w:p>
     <w:pPr>
       <w:pStyle w:val="Header"/>
@@ -2696,39 +2696,39 @@
           <wp:wrapNone/>
           <wp:docPr id="685440492" name="Picture 685440492"/>
           <wp:cNvGraphicFramePr>
-            <a:graphicFrameLocks xmlns:a="http://schemas.openxmlformats.org/drawingml/2006/main" noChangeAspect="1"/>
+            <ns5:graphicFrameLocks noChangeAspect="1"/>
           </wp:cNvGraphicFramePr>
-          <a:graphic xmlns:a="http://schemas.openxmlformats.org/drawingml/2006/main">
-            <a:graphicData uri="http://schemas.openxmlformats.org/drawingml/2006/picture">
-              <pic:pic xmlns:pic="http://schemas.openxmlformats.org/drawingml/2006/picture">
-                <pic:nvPicPr>
-                  <pic:cNvPr id="0" name="UPS_letterhead_header.jpg"/>
-                  <pic:cNvPicPr/>
-                </pic:nvPicPr>
-                <pic:blipFill>
-                  <a:blip r:embed="rId1">
-                    <a:extLst>
-                      <a:ext uri="{28A0092B-C50C-407E-A947-70E740481C1C}">
-                        <a14:useLocalDpi xmlns:a14="http://schemas.microsoft.com/office/drawing/2010/main" val="0"/>
-                      </a:ext>
-                    </a:extLst>
-                  </a:blip>
-                  <a:stretch>
-                    <a:fillRect/>
-                  </a:stretch>
-                </pic:blipFill>
-                <pic:spPr>
-                  <a:xfrm>
-                    <a:off x="0" y="0"/>
-                    <a:ext cx="2514600" cy="1173480"/>
-                  </a:xfrm>
-                  <a:prstGeom prst="rect">
-                    <a:avLst/>
-                  </a:prstGeom>
-                </pic:spPr>
-              </pic:pic>
-            </a:graphicData>
-          </a:graphic>
+          <ns5:graphic>
+            <ns5:graphicData uri="http://schemas.openxmlformats.org/drawingml/2006/picture">
+              <ns6:pic>
+                <ns6:nvPicPr>
+                  <ns6:cNvPr id="0" name="UPS_letterhead_header.jpg"/>
+                  <ns6:cNvPicPr/>
+                </ns6:nvPicPr>
+                <ns6:blipFill>
+                  <ns5:blip r:embed="rId1">
+                    <ns5:extLst>
+                      <ns5:ext uri="{28A0092B-C50C-407E-A947-70E740481C1C}">
+                        <ns8:useLocalDpi val="0"/>
+                      </ns5:ext>
+                    </ns5:extLst>
+                  </ns5:blip>
+                  <ns5:stretch>
+                    <ns5:fillRect/>
+                  </ns5:stretch>
+                </ns6:blipFill>
+                <ns6:spPr>
+                  <ns5:xfrm>
+                    <ns5:off x="0" y="0"/>
+                    <ns5:ext cx="2514600" cy="1173480"/>
+                  </ns5:xfrm>
+                  <ns5:prstGeom prst="rect">
+                    <ns5:avLst/>
+                  </ns5:prstGeom>
+                </ns6:spPr>
+              </ns6:pic>
+            </ns5:graphicData>
+          </ns5:graphic>
         </wp:anchor>
       </w:drawing>
     </w:r>
@@ -2756,44 +2756,44 @@
           <wp:wrapNone/>
           <wp:docPr id="522363635" name="Picture 522363635"/>
           <wp:cNvGraphicFramePr>
-            <a:graphicFrameLocks xmlns:a="http://schemas.openxmlformats.org/drawingml/2006/main" noChangeAspect="1"/>
+            <ns5:graphicFrameLocks noChangeAspect="1"/>
           </wp:cNvGraphicFramePr>
-          <a:graphic xmlns:a="http://schemas.openxmlformats.org/drawingml/2006/main">
-            <a:graphicData uri="http://schemas.openxmlformats.org/drawingml/2006/picture">
-              <pic:pic xmlns:pic="http://schemas.openxmlformats.org/drawingml/2006/picture">
-                <pic:nvPicPr>
-                  <pic:cNvPr id="0" name="UPS_letterhead_watermark.jpg"/>
-                  <pic:cNvPicPr/>
-                </pic:nvPicPr>
-                <pic:blipFill>
-                  <a:blip r:embed="rId2">
-                    <a:extLst>
-                      <a:ext uri="{28A0092B-C50C-407E-A947-70E740481C1C}">
-                        <a14:useLocalDpi xmlns:a14="http://schemas.microsoft.com/office/drawing/2010/main" val="0"/>
-                      </a:ext>
-                    </a:extLst>
-                  </a:blip>
-                  <a:stretch>
-                    <a:fillRect/>
-                  </a:stretch>
-                </pic:blipFill>
-                <pic:spPr>
-                  <a:xfrm>
-                    <a:off x="0" y="0"/>
-                    <a:ext cx="7559040" cy="7775448"/>
-                  </a:xfrm>
-                  <a:prstGeom prst="rect">
-                    <a:avLst/>
-                  </a:prstGeom>
-                  <a:extLst>
-                    <a:ext uri="{FAA26D3D-D897-4be2-8F04-BA451C77F1D7}">
-                      <ma14:placeholderFlag xmlns:a14="http://schemas.microsoft.com/office/drawing/2010/main" xmlns:arto="http://schemas.microsoft.com/office/word/2006/arto" xmlns:ve="http://schemas.openxmlformats.org/markup-compatibility/2006" xmlns="" xmlns:mo="http://schemas.microsoft.com/office/mac/office/2008/main" xmlns:mv="urn:schemas-microsoft-com:mac:vml" xmlns:o="urn:schemas-microsoft-com:office:office" xmlns:v="urn:schemas-microsoft-com:vml" xmlns:w10="urn:schemas-microsoft-com:office:word" xmlns:w="http://schemas.openxmlformats.org/wordprocessingml/2006/main" xmlns:ma14="http://schemas.microsoft.com/office/mac/drawingml/2011/main" xmlns:w16sdtfl="http://schemas.microsoft.com/office/word/2024/wordml/sdtformatlock"/>
-                    </a:ext>
-                  </a:extLst>
-                </pic:spPr>
-              </pic:pic>
-            </a:graphicData>
-          </a:graphic>
+          <ns5:graphic>
+            <ns5:graphicData uri="http://schemas.openxmlformats.org/drawingml/2006/picture">
+              <ns6:pic>
+                <ns6:nvPicPr>
+                  <ns6:cNvPr id="0" name="UPS_letterhead_watermark.jpg"/>
+                  <ns6:cNvPicPr/>
+                </ns6:nvPicPr>
+                <ns6:blipFill>
+                  <ns5:blip r:embed="rId2">
+                    <ns5:extLst>
+                      <ns5:ext uri="{28A0092B-C50C-407E-A947-70E740481C1C}">
+                        <ns8:useLocalDpi val="0"/>
+                      </ns5:ext>
+                    </ns5:extLst>
+                  </ns5:blip>
+                  <ns5:stretch>
+                    <ns5:fillRect/>
+                  </ns5:stretch>
+                </ns6:blipFill>
+                <ns6:spPr>
+                  <ns5:xfrm>
+                    <ns5:off x="0" y="0"/>
+                    <ns5:ext cx="7559040" cy="7775448"/>
+                  </ns5:xfrm>
+                  <ns5:prstGeom prst="rect">
+                    <ns5:avLst/>
+                  </ns5:prstGeom>
+                  <ns5:extLst>
+                    <ns5:ext uri="{FAA26D3D-D897-4be2-8F04-BA451C77F1D7}">
+                      <ns9:placeholderFlag/>
+                    </ns5:ext>
+                  </ns5:extLst>
+                </ns6:spPr>
+              </ns6:pic>
+            </ns5:graphicData>
+          </ns5:graphic>
         </wp:anchor>
       </w:drawing>
     </w:r>
@@ -2871,7 +2871,7 @@
         <w:sz w:val="16"/>
         <w:szCs w:val="16"/>
       </w:rPr>
-      <w:t>Routine</w:t>
+      <w:t>{report_title}</w:t>
     </w:r>
     <w:r>
       <w:rPr>
@@ -2881,7 +2881,7 @@
         <w:sz w:val="16"/>
         <w:szCs w:val="16"/>
       </w:rPr>
-      <w:t xml:space="preserve"> Inspection</w:t>
+      <w:t xml:space="preserve"/>
     </w:r>
     <w:r>
       <w:rPr>
@@ -2891,7 +2891,7 @@
         <w:sz w:val="16"/>
         <w:szCs w:val="16"/>
       </w:rPr>
-      <w:t xml:space="preserve"> Report</w:t>
+      <w:t xml:space="preserve"/>
     </w:r>
   </w:p>
   <w:p>

</xml_diff>